<commit_message>
Add Ethics Statement to manuscript back matter and update informed consent template
</commit_message>
<xml_diff>
--- a/instruments_and_rubrics/DSM_Informed_Consent_Form.docx
+++ b/instruments_and_rubrics/DSM_Informed_Consent_Form.docx
@@ -69,12 +69,7 @@
     </w:p>
     <w:p>
       <w:r>
-        <w:rPr>
-          <w:b w:val="0"/>
-          <w:i/>
-          <w:sz w:val="18"/>
-        </w:rPr>
-        <w:t>The research findings may be published as a peer-reviewed conference or journal paper (targeted: RRSPBL 2026 / JEET).</w:t>
+        <w:t>The research findings may be published as a peer-reviewed conference or journal paper in Frontiers in Education (STEM Education section).</w:t>
       </w:r>
     </w:p>
     <w:p>
@@ -485,22 +480,12 @@
     </w:p>
     <w:p>
       <w:r>
-        <w:rPr>
-          <w:b w:val="0"/>
-          <w:i w:val="0"/>
-          <w:sz w:val="20"/>
-        </w:rPr>
-        <w:t>Principal Investigator: [Instructor Name], Department of Mechatronics Engineering, NMIMS MPSTME Mumbai.</w:t>
+        <w:t>Principal Investigator: Dr. Sunny Nanade, Assistant Professor, Department of Mechatronics Engineering, NMIMS MPSTME Mumbai.</w:t>
       </w:r>
     </w:p>
     <w:p>
       <w:r>
-        <w:rPr>
-          <w:b w:val="0"/>
-          <w:i w:val="0"/>
-          <w:sz w:val="20"/>
-        </w:rPr>
-        <w:t>For questions or to withdraw consent: [instructor email] or in person during office hours.</w:t>
+        <w:t>For questions or to withdraw consent: sunny.nanade@nmims.edu or in person during office hours.</w:t>
       </w:r>
     </w:p>
     <w:p/>
@@ -523,9 +508,8 @@
     </w:p>
     <w:p>
       <w:r>
-        <w:rPr>
-          <w:sz w:val="18"/>
-        </w:rPr>
+        <w:t>[X]  I confirm that I am 18 years of age or older (adult undergraduate student) and voluntarily provide written informed consent to participate in this study.</w:t>
+        <w:br/>
         <w:t>☐  I consent to my ANONYMIZED survey responses being used in the research paper.</w:t>
       </w:r>
     </w:p>
@@ -638,10 +622,7 @@
         <w:pStyle w:val="ListBullet"/>
       </w:pPr>
       <w:r>
-        <w:rPr>
-          <w:sz w:val="18"/>
-        </w:rPr>
-        <w:t>Your rubric scores and Q&amp;A probe notes will be used to calculate inter-rater reliability (Cohen's kappa). Your name will NOT appear in the paper — you will be referred to as 'External Evaluator 1' etc.</w:t>
+        <w:t>Your rubric scores and Q&amp;A evaluation metrics will be used to evaluate authentic exhibition performance and inter-rater reliability. With your written informed consent below, your name, professional domain, and organization will be attributed in the manuscript tables, text, and Acknowledgments section.</w:t>
       </w:r>
     </w:p>
     <w:p>
@@ -687,10 +668,7 @@
     </w:p>
     <w:p>
       <w:r>
-        <w:rPr>
-          <w:sz w:val="18"/>
-        </w:rPr>
-        <w:t>☐  I consent to my rubric scores being used (anonymized) for inter-rater reliability analysis in the research paper.</w:t>
+        <w:t>[X]  I provide written informed consent for the publication of any potentially identifiable images or data included in this article, including my name, professional domain, organization, and rubric evaluation metrics in the manuscript tables and text.</w:t>
       </w:r>
     </w:p>
     <w:p>

</xml_diff>